<commit_message>
Clean repo and apply .gitignore
</commit_message>
<xml_diff>
--- a/FER202_Block3/slot3/EX1,EX2-slot3.docx
+++ b/FER202_Block3/slot3/EX1,EX2-slot3.docx
@@ -38,12 +38,12 @@
           <wp:inline distB="114300" distT="114300" distL="114300" distR="114300">
             <wp:extent cx="5731200" cy="2882900"/>
             <wp:effectExtent b="0" l="0" r="0" t="0"/>
-            <wp:docPr id="3" name="image2.png"/>
+            <wp:docPr id="3" name="image3.png"/>
             <a:graphic>
               <a:graphicData uri="http://schemas.openxmlformats.org/drawingml/2006/picture">
                 <pic:pic>
                   <pic:nvPicPr>
-                    <pic:cNvPr id="0" name="image2.png"/>
+                    <pic:cNvPr id="0" name="image3.png"/>
                     <pic:cNvPicPr preferRelativeResize="0"/>
                   </pic:nvPicPr>
                   <pic:blipFill>
@@ -9934,12 +9934,12 @@
           <wp:inline distB="114300" distT="114300" distL="114300" distR="114300">
             <wp:extent cx="5731200" cy="2679700"/>
             <wp:effectExtent b="0" l="0" r="0" t="0"/>
-            <wp:docPr id="2" name="image3.png"/>
+            <wp:docPr id="2" name="image2.png"/>
             <a:graphic>
               <a:graphicData uri="http://schemas.openxmlformats.org/drawingml/2006/picture">
                 <pic:pic>
                   <pic:nvPicPr>
-                    <pic:cNvPr id="0" name="image3.png"/>
+                    <pic:cNvPr id="0" name="image2.png"/>
                     <pic:cNvPicPr preferRelativeResize="0"/>
                   </pic:nvPicPr>
                   <pic:blipFill>

</xml_diff>